<commit_message>
docs: link do repositório no README e no formulário da entrega
</commit_message>
<xml_diff>
--- a/entrega/PIT_atividade_8_preenchido.docx
+++ b/entrega/PIT_atividade_8_preenchido.docx
@@ -261,7 +261,7 @@
           <w:bCs/>
           <w:i w:val="0"/>
         </w:rPr>
-        <w:t>[PENDENTE]</w:t>
+        <w:t>https://github.com/davystresserr/agendafacil-pit2</w:t>
       </w:r>
     </w:p>
     <w:p>
@@ -838,7 +838,7 @@
                 <w:i w:val="0"/>
                 <w:iCs/>
               </w:rPr>
-              <w:t>[PENDENTE]</w:t>
+              <w:t>https://github.com/davystresserr/agendafacil-pit2</w:t>
             </w:r>
           </w:p>
         </w:tc>

</xml_diff>